<commit_message>
Roteiro Bruno & Marrone: revisão da parte 1
Co-Authored-By: Claude Opus 5.5 <noreply@anthropic.com>
Claude-Session: https://claude.ai/code/session_01MJjUEEZrxQDEUifKK2vj9g
</commit_message>
<xml_diff>
--- a/roteiros/bruno-marrone/BrunoMarrone_Parte1_Introducao.docx
+++ b/roteiros/bruno-marrone/BrunoMarrone_Parte1_Introducao.docx
@@ -71,7 +71,7 @@
         <w:rPr>
           <w:color w:val="000000"/>
         </w:rPr>
-        <w:t>Guarde esse detalhe da farmácia. Parece pequeno. Mas, anos mais tarde, remédio e bebida iam aparecer juntos na mesma frase, num pedido de desculpas que o Brasil inteiro ouviu.</w:t>
+        <w:t>Guarde esse detalhe da farmácia. Parece pequeno. Mas, anos mais tarde, remédio e bebida iam aparecer juntos na mesma frase, num pedido de desculpas que ganhou as manchetes.</w:t>
       </w:r>
     </w:p>
     <w:p>
@@ -87,7 +87,7 @@
         <w:rPr>
           <w:color w:val="000000"/>
         </w:rPr>
-        <w:t>E a Goiânia dos anos oitenta era o lugar certo para quem sonhava com isso. A cidade fervia de duplas sertanejas. Cantores jovens se apresentavam onde desse, em festas, bares, exposições de gado e até num palco montado no zoológico da cidade.</w:t>
+        <w:t>A Goiânia dos anos oitenta era o lugar certo para quem sonhava com isso. A cidade fervia de duplas sertanejas. Cantores jovens se apresentavam onde desse, de bares a exposições de gado, e até num palco montado no zoológico da cidade.</w:t>
       </w:r>
     </w:p>
     <w:p>
@@ -103,7 +103,7 @@
         <w:rPr>
           <w:color w:val="000000"/>
         </w:rPr>
-        <w:t>O nome dele era José Roberto Ferreira. Tocava sanfona e tinha a voz aguda, limpa, perfeita para fazer a segunda voz de uma dupla.</w:t>
+        <w:t>O nome dele era José Roberto Ferreira. Tocava sanfona e tinha a voz aguda e limpa, perfeita para fazer a segunda voz de uma dupla.</w:t>
       </w:r>
     </w:p>
     <w:p>
@@ -183,7 +183,7 @@
         <w:rPr>
           <w:color w:val="000000"/>
         </w:rPr>
-        <w:t>E nasceu a dupla Bruno e Marrone.</w:t>
+        <w:t>Nascia a dupla Bruno e Marrone.</w:t>
       </w:r>
     </w:p>
     <w:p>
@@ -207,7 +207,7 @@
         <w:rPr>
           <w:color w:val="C00000"/>
         </w:rPr>
-        <w:t>Imagine a rotina daqueles anos. Um palco improvisado num canto de bar, a madrugada inteira pela frente e, em cima de cada mesa, uma garrafa. Para dois rapazes que viviam de cantar ali, a bebida fazia parte do cenário, noite após noite. E um deles nunca mais conseguiu separar uma coisa da outra.</w:t>
+        <w:t>Imagine a rotina daqueles anos. Um palco improvisado num canto de bar, a madrugada inteira pela frente e, em cima de cada mesa, uma garrafa. Para dois rapazes que viviam de cantar ali, a bebida fazia parte do cenário, noite após noite. E, para um deles, essa mistura ia deixar marcas pelo resto da carreira.</w:t>
       </w:r>
     </w:p>
     <w:p>
@@ -239,7 +239,7 @@
         <w:rPr>
           <w:color w:val="000000"/>
         </w:rPr>
-        <w:t>Enquanto duplas que tinham começado junto com eles, como Leandro e Leonardo, lotavam estádios e apareciam em todos os programas de televisão, Bruno e Marrone continuavam nos bares. O próprio Leonardo, que tinha apresentado os dois, virou um astro nacional. E eles seguiam na estrada, de cidade em cidade, esperando a vez deles.</w:t>
+        <w:t>Enquanto duplas da mesma geração, como Leandro e Leonardo, lotavam estádios e apareciam em todos os programas de televisão, Bruno e Marrone continuavam nos bares. O próprio Leonardo, que tinha apresentado os dois, virou um astro nacional. E eles seguiam na estrada, de cidade em cidade, esperando a vez deles.</w:t>
       </w:r>
     </w:p>
     <w:p>
@@ -269,9 +269,9 @@
     <w:p>
       <w:r>
         <w:rPr>
-          <w:color w:val="C00000"/>
+          <w:color w:val="000000"/>
         </w:rPr>
-        <w:t>Aqui é onde tudo muda. Porque, no ano dois mil e um, uma única gravação ia tirar Bruno e Marrone dos bares e colocar os dois no topo do país. E o sucesso que eles esperaram durante quinze anos ia trazer junto uma conta que ninguém imaginava.</w:t>
+        <w:t>Tudo ia mudar no ano dois mil e um. Porque, naquele ano, uma única gravação ia tirar Bruno e Marrone dos bares e colocar os dois no topo do país. E o sucesso que eles esperaram durante quinze anos ia trazer junto uma conta que ninguém imaginava.</w:t>
       </w:r>
     </w:p>
     <w:p>

</xml_diff>

<commit_message>
Bruno & Marrone: auditoria anti-IA e retenção do roteiro completo
Co-Authored-By: Claude Opus 5.5 <noreply@anthropic.com>
Claude-Session: https://claude.ai/code/session_01MJjUEEZrxQDEUifKK2vj9g
</commit_message>
<xml_diff>
--- a/roteiros/bruno-marrone/BrunoMarrone_Parte1_Introducao.docx
+++ b/roteiros/bruno-marrone/BrunoMarrone_Parte1_Introducao.docx
@@ -111,7 +111,7 @@
         <w:rPr>
           <w:color w:val="C00000"/>
         </w:rPr>
-        <w:t>E é aqui que entra um nome que você conhece muito bem. Porque quem juntou Bruno e Marrone foi um cantor que, poucos anos depois, ia se tornar um dos maiores ídolos do sertanejo. E ele nem imaginava o que estava criando.</w:t>
+        <w:t>Agora entra um nome que você conhece muito bem. Porque quem juntou Bruno e Marrone foi um cantor que, poucos anos depois, ia se tornar um dos maiores ídolos do sertanejo. E ele nem imaginava o que estava criando.</w:t>
       </w:r>
     </w:p>
     <w:p>
@@ -295,7 +295,7 @@
         <w:rPr>
           <w:color w:val="C00000"/>
         </w:rPr>
-        <w:t>E no começo daquela entrevista, Marrone disse uma frase que ninguém esperava ouvir. Uma frase que fez muitos fãs olharem para a dupla de outro jeito. Você vai ouvir cada palavra dela. Mas primeiro, você precisa ver o que aconteceu quando Bruno e Marrone finalmente chegaram ao topo.</w:t>
+        <w:t>No começo daquela entrevista, Marrone disse uma frase que pegou de surpresa até quem acompanhava a dupla havia décadas. Uma frase que fez muitos fãs olharem para a dupla de outro jeito. Você vai ouvir cada palavra dela. Mas primeiro, você precisa ver o que aconteceu quando Bruno e Marrone finalmente chegaram ao topo.</w:t>
       </w:r>
     </w:p>
     <w:sectPr>

</xml_diff>